<commit_message>
DOCS: Working on convertation md to docx x5.1 - Updating actions/checkout version and reference.docx
</commit_message>
<xml_diff>
--- a/reference.docx
+++ b/reference.docx
@@ -25,73 +25,73 @@
       <w:r>
         <w:t>Author</w:t>
       </w:r>
-      <w:bookmarkStart w:id="0" w:name="_GoBack"/>
+    </w:p>
+    <w:p>
+      <w:pPr>
+        <w:pStyle w:val="a9"/>
+      </w:pPr>
+      <w:r>
+        <w:t>Date</w:t>
+      </w:r>
+    </w:p>
+    <w:p>
+      <w:pPr>
+        <w:pStyle w:val="Abstract"/>
+      </w:pPr>
+      <w:r>
+        <w:t>Abstract</w:t>
+      </w:r>
+    </w:p>
+    <w:p>
+      <w:pPr>
+        <w:pStyle w:val="1"/>
+      </w:pPr>
+      <w:bookmarkStart w:id="0" w:name="heading-1"/>
+      <w:r>
+        <w:t>Heading 1</w:t>
+      </w:r>
       <w:bookmarkEnd w:id="0"/>
     </w:p>
     <w:p>
       <w:pPr>
-        <w:pStyle w:val="a9"/>
-      </w:pPr>
-      <w:r>
-        <w:t>Date</w:t>
-      </w:r>
-    </w:p>
-    <w:p>
-      <w:pPr>
-        <w:pStyle w:val="Abstract"/>
-      </w:pPr>
-      <w:r>
-        <w:t>Abstract</w:t>
-      </w:r>
-    </w:p>
-    <w:p>
-      <w:pPr>
-        <w:pStyle w:val="1"/>
-      </w:pPr>
-      <w:bookmarkStart w:id="1" w:name="heading-1"/>
-      <w:r>
-        <w:t>Heading 1</w:t>
+        <w:pStyle w:val="2"/>
+      </w:pPr>
+      <w:bookmarkStart w:id="1" w:name="heading-2"/>
+      <w:r>
+        <w:t>Heading 2</w:t>
       </w:r>
       <w:bookmarkEnd w:id="1"/>
     </w:p>
     <w:p>
       <w:pPr>
-        <w:pStyle w:val="2"/>
-      </w:pPr>
-      <w:bookmarkStart w:id="2" w:name="heading-2"/>
-      <w:r>
-        <w:t>Heading 2</w:t>
+        <w:pStyle w:val="3"/>
+      </w:pPr>
+      <w:bookmarkStart w:id="2" w:name="heading-3"/>
+      <w:r>
+        <w:t>Heading 3</w:t>
       </w:r>
       <w:bookmarkEnd w:id="2"/>
     </w:p>
     <w:p>
       <w:pPr>
-        <w:pStyle w:val="3"/>
-      </w:pPr>
-      <w:bookmarkStart w:id="3" w:name="heading-3"/>
-      <w:r>
-        <w:t>Heading 3</w:t>
+        <w:pStyle w:val="4"/>
+      </w:pPr>
+      <w:bookmarkStart w:id="3" w:name="heading-4"/>
+      <w:r>
+        <w:t>Heading 4</w:t>
       </w:r>
       <w:bookmarkEnd w:id="3"/>
     </w:p>
     <w:p>
       <w:pPr>
-        <w:pStyle w:val="4"/>
-      </w:pPr>
-      <w:bookmarkStart w:id="4" w:name="heading-4"/>
-      <w:r>
-        <w:t>Heading 4</w:t>
-      </w:r>
+        <w:pStyle w:val="5"/>
+      </w:pPr>
+      <w:bookmarkStart w:id="4" w:name="heading-5"/>
+      <w:r>
+        <w:t>Heading 5</w:t>
+      </w:r>
+      <w:bookmarkStart w:id="5" w:name="_GoBack"/>
       <w:bookmarkEnd w:id="4"/>
-    </w:p>
-    <w:p>
-      <w:pPr>
-        <w:pStyle w:val="5"/>
-      </w:pPr>
-      <w:bookmarkStart w:id="5" w:name="heading-5"/>
-      <w:r>
-        <w:t>Heading 5</w:t>
-      </w:r>
       <w:bookmarkEnd w:id="5"/>
     </w:p>
     <w:p>
@@ -304,6 +304,7 @@
       </w:r>
     </w:p>
     <w:sectPr>
+      <w:footerReference w:type="default" r:id="rId8"/>
       <w:footnotePr>
         <w:numRestart w:val="eachSect"/>
       </w:footnotePr>
@@ -339,6 +340,47 @@
     </w:p>
   </w:endnote>
 </w:endnotes>
+</file>
+
+<file path=word/footer1.xml><?xml version="1.0" encoding="utf-8"?>
+<w:ftr xmlns:wpc="http://schemas.microsoft.com/office/word/2010/wordprocessingCanvas" xmlns:mc="http://schemas.openxmlformats.org/markup-compatibility/2006" xmlns:o="urn:schemas-microsoft-com:office:office" xmlns:r="http://schemas.openxmlformats.org/officeDocument/2006/relationships" xmlns:m="http://schemas.openxmlformats.org/officeDocument/2006/math" xmlns:v="urn:schemas-microsoft-com:vml" xmlns:wp14="http://schemas.microsoft.com/office/word/2010/wordprocessingDrawing" xmlns:wp="http://schemas.openxmlformats.org/drawingml/2006/wordprocessingDrawing" xmlns:w10="urn:schemas-microsoft-com:office:word" xmlns:w="http://schemas.openxmlformats.org/wordprocessingml/2006/main" xmlns:w14="http://schemas.microsoft.com/office/word/2010/wordml" xmlns:w15="http://schemas.microsoft.com/office/word/2012/wordml" xmlns:wpg="http://schemas.microsoft.com/office/word/2010/wordprocessingGroup" xmlns:wpi="http://schemas.microsoft.com/office/word/2010/wordprocessingInk" xmlns:wne="http://schemas.microsoft.com/office/word/2006/wordml" xmlns:wps="http://schemas.microsoft.com/office/word/2010/wordprocessingShape" mc:Ignorable="w14 w15 wp14">
+  <w:sdt>
+    <w:sdtPr>
+      <w:id w:val="-1216355842"/>
+      <w:docPartObj>
+        <w:docPartGallery w:val="Page Numbers (Bottom of Page)"/>
+        <w:docPartUnique/>
+      </w:docPartObj>
+    </w:sdtPr>
+    <w:sdtContent>
+      <w:p>
+        <w:pPr>
+          <w:pStyle w:val="af4"/>
+          <w:jc w:val="center"/>
+        </w:pPr>
+        <w:r>
+          <w:fldChar w:fldCharType="begin"/>
+        </w:r>
+        <w:r>
+          <w:instrText>PAGE   \* MERGEFORMAT</w:instrText>
+        </w:r>
+        <w:r>
+          <w:fldChar w:fldCharType="separate"/>
+        </w:r>
+        <w:r>
+          <w:rPr>
+            <w:noProof/>
+            <w:lang w:val="ru-RU"/>
+          </w:rPr>
+          <w:t>1</w:t>
+        </w:r>
+        <w:r>
+          <w:fldChar w:fldCharType="end"/>
+        </w:r>
+      </w:p>
+    </w:sdtContent>
+  </w:sdt>
+</w:ftr>
 </file>
 
 <file path=word/footnotes.xml><?xml version="1.0" encoding="utf-8"?>
@@ -746,7 +788,7 @@
     <w:lsdException w:name="footnote text" w:semiHidden="1" w:unhideWhenUsed="1"/>
     <w:lsdException w:name="annotation text" w:semiHidden="1" w:unhideWhenUsed="1"/>
     <w:lsdException w:name="header" w:semiHidden="1" w:unhideWhenUsed="1"/>
-    <w:lsdException w:name="footer" w:semiHidden="1" w:unhideWhenUsed="1"/>
+    <w:lsdException w:name="footer" w:semiHidden="1" w:uiPriority="99" w:unhideWhenUsed="1"/>
     <w:lsdException w:name="index heading" w:semiHidden="1" w:unhideWhenUsed="1"/>
     <w:lsdException w:name="caption" w:semiHidden="1" w:unhideWhenUsed="1"/>
     <w:lsdException w:name="table of figures" w:semiHidden="1" w:unhideWhenUsed="1"/>
@@ -867,6 +909,13 @@
     <w:lsdException w:name="Medium Shading 2"/>
     <w:lsdException w:name="Medium List 1"/>
     <w:lsdException w:name="Medium List 2"/>
+    <w:lsdException w:name="Medium Grid 1"/>
+    <w:lsdException w:name="Medium Grid 2"/>
+    <w:lsdException w:name="Medium Grid 3"/>
+    <w:lsdException w:name="Dark List"/>
+    <w:lsdException w:name="Colorful Shading"/>
+    <w:lsdException w:name="Colorful List"/>
+    <w:lsdException w:name="Colorful Grid"/>
     <w:lsdException w:name="Light Shading Accent 1"/>
     <w:lsdException w:name="Light List Accent 1"/>
     <w:lsdException w:name="Light Grid Accent 1"/>
@@ -1065,11 +1114,12 @@
     <w:link w:val="10"/>
     <w:uiPriority w:val="9"/>
     <w:qFormat/>
-    <w:rsid w:val="00530F99"/>
+    <w:rsid w:val="0047774A"/>
     <w:pPr>
       <w:keepNext/>
       <w:keepLines/>
       <w:spacing w:before="360" w:after="80"/>
+      <w:jc w:val="center"/>
       <w:outlineLvl w:val="0"/>
     </w:pPr>
     <w:rPr>
@@ -1443,7 +1493,7 @@
     <w:basedOn w:val="a1"/>
     <w:link w:val="1"/>
     <w:uiPriority w:val="9"/>
-    <w:rsid w:val="00530F99"/>
+    <w:rsid w:val="0047774A"/>
     <w:rPr>
       <w:rFonts w:ascii="Times New Roman" w:eastAsiaTheme="majorEastAsia" w:hAnsi="Times New Roman" w:cstheme="majorBidi"/>
       <w:b/>
@@ -1711,20 +1761,65 @@
     <w:uiPriority w:val="39"/>
     <w:unhideWhenUsed/>
     <w:qFormat/>
+    <w:rsid w:val="0047774A"/>
     <w:pPr>
       <w:spacing w:before="240" w:line="259" w:lineRule="auto"/>
       <w:outlineLvl w:val="9"/>
     </w:pPr>
-    <w:rPr>
-      <w:rFonts w:asciiTheme="majorHAnsi" w:hAnsiTheme="majorHAnsi"/>
-      <w:color w:val="0F4761" w:themeColor="accent1" w:themeShade="BF"/>
-    </w:rPr>
   </w:style>
   <w:style w:type="character" w:customStyle="1" w:styleId="a4">
     <w:name w:val="Основной текст Знак"/>
     <w:basedOn w:val="a1"/>
     <w:link w:val="a0"/>
     <w:rsid w:val="00530F99"/>
+    <w:rPr>
+      <w:rFonts w:ascii="Times New Roman" w:hAnsi="Times New Roman"/>
+    </w:rPr>
+  </w:style>
+  <w:style w:type="paragraph" w:styleId="af2">
+    <w:name w:val="header"/>
+    <w:basedOn w:val="a"/>
+    <w:link w:val="af3"/>
+    <w:unhideWhenUsed/>
+    <w:rsid w:val="00F04BFD"/>
+    <w:pPr>
+      <w:tabs>
+        <w:tab w:val="center" w:pos="4680"/>
+        <w:tab w:val="right" w:pos="9360"/>
+      </w:tabs>
+      <w:spacing w:after="0"/>
+    </w:pPr>
+  </w:style>
+  <w:style w:type="character" w:customStyle="1" w:styleId="af3">
+    <w:name w:val="Верхний колонтитул Знак"/>
+    <w:basedOn w:val="a1"/>
+    <w:link w:val="af2"/>
+    <w:rsid w:val="00F04BFD"/>
+    <w:rPr>
+      <w:rFonts w:ascii="Times New Roman" w:hAnsi="Times New Roman"/>
+    </w:rPr>
+  </w:style>
+  <w:style w:type="paragraph" w:styleId="af4">
+    <w:name w:val="footer"/>
+    <w:basedOn w:val="a"/>
+    <w:link w:val="af5"/>
+    <w:uiPriority w:val="99"/>
+    <w:unhideWhenUsed/>
+    <w:rsid w:val="00F04BFD"/>
+    <w:pPr>
+      <w:tabs>
+        <w:tab w:val="center" w:pos="4680"/>
+        <w:tab w:val="right" w:pos="9360"/>
+      </w:tabs>
+      <w:spacing w:after="0"/>
+    </w:pPr>
+  </w:style>
+  <w:style w:type="character" w:customStyle="1" w:styleId="af5">
+    <w:name w:val="Нижний колонтитул Знак"/>
+    <w:basedOn w:val="a1"/>
+    <w:link w:val="af4"/>
+    <w:uiPriority w:val="99"/>
+    <w:rsid w:val="00F04BFD"/>
     <w:rPr>
       <w:rFonts w:ascii="Times New Roman" w:hAnsi="Times New Roman"/>
     </w:rPr>

</xml_diff>